<commit_message>
docs(whitepaper): backfill v0.8.3 DOI 10.5281/zenodo.21490478
</commit_message>
<xml_diff>
--- a/releases/v0.8.3/EDM_v0_8_3_Whitepaper_Harvey_2026.docx
+++ b/releases/v0.8.3/EDM_v0_8_3_Whitepaper_Harvey_2026.docx
@@ -80,13 +80,29 @@
           <w:b/>
           <w:bCs/>
         </w:rPr>
-        <w:t xml:space="preserve">DOI: pending — assigned on Zenodo publication (v0.8.1: 10.5281/zenodo.20678017)</w:t>
-      </w:r>
-      <w:r>
-        <w:t xml:space="preserve"/>
-      </w:r>
-      <w:r>
-        <w:t/>
+        <w:t>DOI:</w:t>
+      </w:r>
+      <w:r>
+        <w:rPr>
+          <w:b/>
+          <w:bCs/>
+        </w:rPr>
+        <w:t xml:space="preserve"> </w:t>
+      </w:r>
+      <w:r>
+        <w:t>10.5281/zenodo.21490478 (this version)</w:t>
+      </w:r>
+    </w:p>
+    <w:p>
+      <w:r>
+        <w:rPr>
+          <w:b/>
+          <w:bCs/>
+        </w:rPr>
+        <w:t>Concept DOI:</w:t>
+      </w:r>
+      <w:r>
+        <w:t xml:space="preserve"> 10.5281/zenodo.17808652 (all versions)</w:t>
       </w:r>
     </w:p>
     <w:p>
@@ -6504,99 +6520,11 @@
         <w:jc w:val="both"/>
       </w:pPr>
       <w:r>
-        <w:t xml:space="preserve">The Constellation domain maps the qualitative landscape of the affect. It captures the emotion_primary and emotion_subtone using canonical vocabularies, providing a stable categorical reference that persists across model versions. It records the subject's archetypal identity via the narrative_archetype — which of the twelve canonical identity archetypes the subject embodies, an identity rather than a structural role. The domain distinguishes between routine processing and fundamental shifts in state through the transformational_pivot marker, and captures explicit realisations via expressed_insight. To link text with somatic state, it records the somatic_signature, ensuring that the quality and certainty of the signal are represented as explicitly as its content.</w:t>
-      </w:r>
-      <w:proofErr w:type="gramStart"/>
-      <w:r>
-        <w:t/>
-      </w:r>
-      <w:proofErr w:type="gramEnd"/>
-      <w:r>
-        <w:t xml:space="preserve"/>
-      </w:r>
-      <w:proofErr w:type="spellStart"/>
-      <w:r>
-        <w:rPr>
-          <w:rStyle w:val="codestyle"/>
-        </w:rPr>
-        <w:t/>
-      </w:r>
-      <w:proofErr w:type="spellEnd"/>
-      <w:r>
-        <w:t xml:space="preserve"/>
-      </w:r>
-      <w:proofErr w:type="spellStart"/>
-      <w:r>
-        <w:rPr>
-          <w:rStyle w:val="codestyle"/>
-        </w:rPr>
-        <w:t/>
-      </w:r>
-      <w:proofErr w:type="spellEnd"/>
-      <w:r>
-        <w:t xml:space="preserve"/>
-      </w:r>
-      <w:proofErr w:type="spellStart"/>
-      <w:r>
-        <w:rPr>
-          <w:rStyle w:val="codestyle"/>
-        </w:rPr>
+        <w:t xml:space="preserve">The Constellation domain maps the qualitative landscape of the affect. It captures the emotion_primary and emotion_subtone using canonical vocabularies, providing a stable categorical reference that persists across model versions. It records the subject's archetypal identity via the narrative_archetype — which of </w:t>
+      </w:r>
+      <w:r>
         <w:lastRenderedPageBreak/>
-        <w:t/>
-      </w:r>
-      <w:proofErr w:type="spellEnd"/>
-      <w:r>
-        <w:rPr>
-          <w:rStyle w:val="codestyle"/>
-        </w:rPr>
-        <w:t/>
-      </w:r>
-      <w:r>
-        <w:t xml:space="preserve"/>
-      </w:r>
-      <w:proofErr w:type="spellStart"/>
-      <w:r>
-        <w:rPr>
-          <w:rStyle w:val="codestyle"/>
-        </w:rPr>
-        <w:t/>
-      </w:r>
-      <w:proofErr w:type="spellEnd"/>
-      <w:r>
-        <w:rPr>
-          <w:rStyle w:val="codestyle"/>
-        </w:rPr>
-        <w:t xml:space="preserve"/>
-      </w:r>
-      <w:proofErr w:type="gramStart"/>
-      <w:r>
-        <w:t/>
-      </w:r>
-      <w:proofErr w:type="gramEnd"/>
-      <w:r>
-        <w:t xml:space="preserve"/>
-      </w:r>
-      <w:proofErr w:type="spellStart"/>
-      <w:r>
-        <w:rPr>
-          <w:rStyle w:val="codestyle"/>
-        </w:rPr>
-        <w:t/>
-      </w:r>
-      <w:proofErr w:type="spellEnd"/>
-      <w:r>
-        <w:t xml:space="preserve"/>
-      </w:r>
-      <w:proofErr w:type="spellStart"/>
-      <w:r>
-        <w:rPr>
-          <w:rStyle w:val="codestyle"/>
-        </w:rPr>
-        <w:t/>
-      </w:r>
-      <w:proofErr w:type="spellEnd"/>
-      <w:r>
-        <w:t/>
+        <w:t>the twelve canonical identity archetypes the subject embodies, an identity rather than a structural role. The domain distinguishes between routine processing and fundamental shifts in state through the transformational_pivot marker, and captures explicit realisations via expressed_insight. To link text with somatic state, it records the somatic_signature, ensuring that the quality and certainty of the signal are represented as explicitly as its content.</w:t>
       </w:r>
     </w:p>
     <w:p>
@@ -6910,22 +6838,22 @@
         <w:t xml:space="preserve"> </w:t>
       </w:r>
       <w:r>
-        <w:t xml:space="preserve">determining its lifespan, and </w:t>
+        <w:t xml:space="preserve">determining its lifespan, and the </w:t>
+      </w:r>
+      <w:proofErr w:type="spellStart"/>
+      <w:r>
+        <w:rPr>
+          <w:rStyle w:val="codestyle"/>
+        </w:rPr>
+        <w:t>subject_rights</w:t>
+      </w:r>
+      <w:proofErr w:type="spellEnd"/>
+      <w:r>
+        <w:t xml:space="preserve"> (such as portability and erasure) that travel with the </w:t>
       </w:r>
       <w:r>
         <w:lastRenderedPageBreak/>
-        <w:t xml:space="preserve">the </w:t>
-      </w:r>
-      <w:proofErr w:type="spellStart"/>
-      <w:r>
-        <w:rPr>
-          <w:rStyle w:val="codestyle"/>
-        </w:rPr>
-        <w:t>subject_rights</w:t>
-      </w:r>
-      <w:proofErr w:type="spellEnd"/>
-      <w:r>
-        <w:t xml:space="preserve"> (such as portability and erasure) that travel with the object. This in-band governance model ensures that compliance and user rights are preserved even as the artifact moves across vendor boundaries.</w:t>
+        <w:t>object. This in-band governance model ensures that compliance and user rights are preserved even as the artifact moves across vendor boundaries.</w:t>
       </w:r>
     </w:p>
     <w:p>
@@ -10476,294 +10404,6 @@
       <w:r>
         <w:t xml:space="preserve">The EDM version lineage reflects the incremental expansion of representational structure while maintaining all prior semantics. v0.1 introduced the initial domain layout and core governance constructs. v0.2 stabilised domain boundaries, normalised narrative primitives, and formalised governance invariants. v0.3 introduced the crosswalk architecture, refined governance fields, and established alignment with the .ddna envelope layer. v0.4.0 solidified these definitions into a normative standard. v0.5.0 updated the envelope cryptographic model to W3C Data Integrity Proofs and expanded five canonical enumerations — emotion_primary, relational_dynamics, drive_state, coping_style, and adaptation_trajectory to capture expressive states identified through systematic multi-provider evaluation. v0.6.0 introduces Implementation Profiles (Essential, Extended, Full), Conformance Levels (Compliant, Sealed, Certified), and Profile Completeness as the canonical structural invariant, replacing the prior Domain Completeness model. Nine enumeration values were added across five fields — emotion_primary (shame), relational_dynamics (grandparent_grandchild, friend, couple, colleague), narrative_archetype (orphan), tether_type (identity, self), and motivational_orientation (authenticity) — validated through end-to-end corpus evaluation. </w:t>
       </w:r>
-      <w:proofErr w:type="gramStart"/>
-      <w:r>
-        <w:t/>
-      </w:r>
-      <w:proofErr w:type="spellStart"/>
-      <w:r>
-        <w:t/>
-      </w:r>
-      <w:proofErr w:type="spellEnd"/>
-      <w:proofErr w:type="gramEnd"/>
-      <w:r>
-        <w:t xml:space="preserve"/>
-      </w:r>
-      <w:proofErr w:type="spellStart"/>
-      <w:r>
-        <w:rPr>
-          <w:rStyle w:val="codestyle"/>
-        </w:rPr>
-        <w:t/>
-      </w:r>
-      <w:proofErr w:type="spellEnd"/>
-      <w:r>
-        <w:t xml:space="preserve"/>
-      </w:r>
-      <w:proofErr w:type="spellStart"/>
-      <w:r>
-        <w:rPr>
-          <w:rStyle w:val="codestyle"/>
-        </w:rPr>
-        <w:t/>
-      </w:r>
-      <w:proofErr w:type="spellEnd"/>
-      <w:r>
-        <w:t xml:space="preserve"/>
-      </w:r>
-      <w:proofErr w:type="spellStart"/>
-      <w:r>
-        <w:rPr>
-          <w:rStyle w:val="codestyle"/>
-        </w:rPr>
-        <w:t/>
-      </w:r>
-      <w:proofErr w:type="spellEnd"/>
-      <w:r>
-        <w:t xml:space="preserve"/>
-      </w:r>
-      <w:proofErr w:type="spellStart"/>
-      <w:r>
-        <w:rPr>
-          <w:rStyle w:val="codestyle"/>
-        </w:rPr>
-        <w:t/>
-      </w:r>
-      <w:proofErr w:type="spellEnd"/>
-      <w:r>
-        <w:t xml:space="preserve"/>
-      </w:r>
-      <w:proofErr w:type="spellStart"/>
-      <w:r>
-        <w:rPr>
-          <w:rStyle w:val="codestyle"/>
-        </w:rPr>
-        <w:t/>
-      </w:r>
-      <w:proofErr w:type="spellEnd"/>
-      <w:r>
-        <w:t xml:space="preserve"/>
-      </w:r>
-      <w:r>
-        <w:rPr>
-          <w:rStyle w:val="codestyle"/>
-        </w:rPr>
-        <w:t/>
-      </w:r>
-      <w:r>
-        <w:t xml:space="preserve"/>
-      </w:r>
-      <w:r>
-        <w:rPr>
-          <w:rStyle w:val="codestyle"/>
-        </w:rPr>
-        <w:t/>
-      </w:r>
-      <w:r>
-        <w:t xml:space="preserve"/>
-      </w:r>
-      <w:r>
-        <w:rPr>
-          <w:rStyle w:val="codestyle"/>
-        </w:rPr>
-        <w:t/>
-      </w:r>
-      <w:r>
-        <w:t xml:space="preserve"/>
-      </w:r>
-      <w:r>
-        <w:rPr>
-          <w:rStyle w:val="codestyle"/>
-        </w:rPr>
-        <w:t/>
-      </w:r>
-      <w:r>
-        <w:t xml:space="preserve"/>
-      </w:r>
-      <w:r>
-        <w:rPr>
-          <w:rStyle w:val="codestyle"/>
-        </w:rPr>
-        <w:t xml:space="preserve"/>
-      </w:r>
-      <w:r>
-        <w:t/>
-      </w:r>
-      <w:r>
-        <w:rPr>
-          <w:rStyle w:val="codestyle"/>
-        </w:rPr>
-        <w:t/>
-      </w:r>
-      <w:r>
-        <w:t xml:space="preserve"/>
-      </w:r>
-      <w:r>
-        <w:rPr>
-          <w:rStyle w:val="codestyle"/>
-        </w:rPr>
-        <w:t/>
-      </w:r>
-      <w:r>
-        <w:t xml:space="preserve"/>
-      </w:r>
-      <w:r>
-        <w:rPr>
-          <w:rStyle w:val="codestyle"/>
-        </w:rPr>
-        <w:t/>
-      </w:r>
-      <w:r>
-        <w:t xml:space="preserve"/>
-      </w:r>
-      <w:r>
-        <w:rPr>
-          <w:b/>
-          <w:bCs/>
-        </w:rPr>
-        <w:t/>
-      </w:r>
-      <w:r>
-        <w:t xml:space="preserve"/>
-      </w:r>
-      <w:proofErr w:type="spellStart"/>
-      <w:r>
-        <w:rPr>
-          <w:rStyle w:val="codestyle"/>
-        </w:rPr>
-        <w:t/>
-      </w:r>
-      <w:proofErr w:type="spellEnd"/>
-      <w:r>
-        <w:t xml:space="preserve"/>
-      </w:r>
-      <w:r>
-        <w:rPr>
-          <w:rStyle w:val="codestyle"/>
-        </w:rPr>
-        <w:t/>
-      </w:r>
-      <w:r>
-        <w:t xml:space="preserve"/>
-      </w:r>
-      <w:proofErr w:type="spellStart"/>
-      <w:r>
-        <w:rPr>
-          <w:rStyle w:val="codestyle"/>
-        </w:rPr>
-        <w:t/>
-      </w:r>
-      <w:proofErr w:type="spellEnd"/>
-      <w:r>
-        <w:t xml:space="preserve"/>
-      </w:r>
-      <w:proofErr w:type="spellStart"/>
-      <w:r>
-        <w:rPr>
-          <w:rStyle w:val="codestyle"/>
-        </w:rPr>
-        <w:t/>
-      </w:r>
-      <w:proofErr w:type="spellEnd"/>
-      <w:r>
-        <w:t xml:space="preserve"/>
-      </w:r>
-      <w:r>
-        <w:rPr>
-          <w:rStyle w:val="codestyle"/>
-        </w:rPr>
-        <w:t/>
-      </w:r>
-      <w:r>
-        <w:t xml:space="preserve"/>
-      </w:r>
-      <w:r>
-        <w:rPr>
-          <w:rStyle w:val="codestyle"/>
-        </w:rPr>
-        <w:t/>
-      </w:r>
-      <w:r>
-        <w:t xml:space="preserve"/>
-      </w:r>
-      <w:r>
-        <w:rPr>
-          <w:rStyle w:val="codestyle"/>
-        </w:rPr>
-        <w:t/>
-      </w:r>
-      <w:r>
-        <w:t xml:space="preserve"/>
-      </w:r>
-      <w:proofErr w:type="spellStart"/>
-      <w:r>
-        <w:rPr>
-          <w:rStyle w:val="codestyle"/>
-        </w:rPr>
-        <w:t/>
-      </w:r>
-      <w:proofErr w:type="spellEnd"/>
-      <w:r>
-        <w:t xml:space="preserve"/>
-      </w:r>
-      <w:r>
-        <w:rPr>
-          <w:rStyle w:val="codestyle"/>
-        </w:rPr>
-        <w:t/>
-      </w:r>
-      <w:r>
-        <w:t xml:space="preserve"/>
-      </w:r>
-      <w:proofErr w:type="spellStart"/>
-      <w:r>
-        <w:rPr>
-          <w:rStyle w:val="codestyle"/>
-        </w:rPr>
-        <w:t/>
-      </w:r>
-      <w:proofErr w:type="spellEnd"/>
-      <w:r>
-        <w:t xml:space="preserve"/>
-      </w:r>
-      <w:r>
-        <w:rPr>
-          <w:rStyle w:val="codestyle"/>
-        </w:rPr>
-        <w:t/>
-      </w:r>
-      <w:r>
-        <w:t xml:space="preserve"/>
-      </w:r>
-      <w:r>
-        <w:rPr>
-          <w:rStyle w:val="codestyle"/>
-        </w:rPr>
-        <w:t/>
-      </w:r>
-      <w:r>
-        <w:t xml:space="preserve"/>
-      </w:r>
-      <w:proofErr w:type="spellStart"/>
-      <w:r>
-        <w:rPr>
-          <w:rStyle w:val="codestyle"/>
-        </w:rPr>
-        <w:t/>
-      </w:r>
-      <w:proofErr w:type="spellEnd"/>
-      <w:r>
-        <w:t xml:space="preserve"/>
-      </w:r>
-      <w:r>
-        <w:rPr>
-          <w:rStyle w:val="codestyle"/>
-        </w:rPr>
-        <w:t/>
-      </w:r>
-      <w:r>
-        <w:t xml:space="preserve"/>
-      </w:r>
     </w:p>
     <w:p>
       <w:pPr>
@@ -10771,26 +10411,29 @@
         <w:jc w:val="both"/>
       </w:pPr>
       <w:r>
+        <w:t xml:space="preserve">v0.7.0 extends v0.6.0 with seven structural additions and four field deprecations. The </w:t>
+      </w:r>
+      <w:r>
+        <w:rPr>
+          <w:rStyle w:val="codestyle"/>
+        </w:rPr>
+        <w:t>arc_type</w:t>
+      </w:r>
+      <w:r>
+        <w:t xml:space="preserve"> field was added to the </w:t>
+      </w:r>
+      <w:r>
+        <w:rPr>
+          <w:rStyle w:val="codestyle"/>
+        </w:rPr>
+        <w:t>Constellation</w:t>
+      </w:r>
+      <w:r>
+        <w:t xml:space="preserve"> domain, providing </w:t>
+      </w:r>
+      <w:r>
         <w:lastRenderedPageBreak/>
-        <w:t xml:space="preserve">v0.7.0 extends v0.6.0 with seven structural additions and four field deprecations. The </w:t>
-      </w:r>
-      <w:r>
-        <w:rPr>
-          <w:rStyle w:val="codestyle"/>
-        </w:rPr>
-        <w:t>arc_type</w:t>
-      </w:r>
-      <w:r>
-        <w:t xml:space="preserve"> field was added to the </w:t>
-      </w:r>
-      <w:r>
-        <w:rPr>
-          <w:rStyle w:val="codestyle"/>
-        </w:rPr>
-        <w:t>Constellation</w:t>
-      </w:r>
-      <w:r>
-        <w:t xml:space="preserve"> domain, providing twelve canonical narrative arc values (betrayal, liberation, grief, discovery, resistance, bond, </w:t>
+        <w:t xml:space="preserve">twelve canonical narrative arc values (betrayal, liberation, grief, discovery, resistance, bond, </w:t>
       </w:r>
       <w:proofErr w:type="spellStart"/>
       <w:r>
@@ -11155,11 +10798,11 @@
       </w:r>
       <w:proofErr w:type="spellEnd"/>
       <w:r>
-        <w:t xml:space="preserve">, Gravity, and Impulse domains, opening Certified conformance to partner profiles meeting this threshold. Section 3.7.6 (former </w:t>
+        <w:t xml:space="preserve">, Gravity, and Impulse domains, opening Certified conformance to partner profiles meeting this threshold. Section 3.7.6 (former Profile Invariants) is renumbered to Section 3.7.7 to accommodate the new </w:t>
       </w:r>
       <w:r>
         <w:lastRenderedPageBreak/>
-        <w:t>Profile Invariants) is renumbered to Section 3.7.7 to accommodate the new Partner Profiles section. No fields were deprecated in v0.8.0. No existing field meanings or enumeration values have been modified or removed.</w:t>
+        <w:t>Partner Profiles section. No fields were deprecated in v0.8.0. No existing field meanings or enumeration values have been modified or removed.</w:t>
       </w:r>
     </w:p>
     <w:p>
@@ -11219,7 +10862,7 @@
         <w:jc w:val="both"/>
       </w:pPr>
       <w:r>
-        <w:t xml:space="preserve">v0.8.2 is a schema-reconciliation patch that brings the published JSON Schema fragments into alignment with the canonical vocabulary (ADR-0030: the published specification is the source of truth and downstream implementations generate from it). The narrative_archetype enumeration is corrected to the twelve canonical identity archetypes — hero, caregiver, seeker, sage, lover, outlaw, innocent, magician, creator, everyman, jester, ruler. The field encodes the archetypal identity the subject embodies, not a structural role or literary trope: mentor is removed from the fragment enumeration on this ground, and orphan, which earlier documents listed but no shipped v0.8 fragment enumerated, is likewise outside the canonical set. motivational_orientation gains authenticity (self-alignment and identity congruence), aligning the fragment with the canonical vocabulary. The shared meta.profile fragment is reconciled to the two-tier model (canonical enumeration plus the partner: pattern), and a mis-encoded enumeration on meta.tags is removed. A non-validating x-edm-canonical annotation is added to seven two-tier free-text fields, carrying the preferred canonical vocabulary in machine-readable form. The specification is published to npm (edm-spec@0.8.2). No fields are added, removed, or renamed. v0.8.2 shipped without a standalone document; its changes are documented in the v0.8.1-to-v0.8.2 crosswalk and folded into this v0.8.3 document.</w:t>
+        <w:t>v0.8.2 is a schema-reconciliation patch that brings the published JSON Schema fragments into alignment with the canonical vocabulary (ADR-0030: the published specification is the source of truth and downstream implementations generate from it). The narrative_archetype enumeration is corrected to the twelve canonical identity archetypes — hero, caregiver, seeker, sage, lover, outlaw, innocent, magician, creator, everyman, jester, ruler. The field encodes the archetypal identity the subject embodies, not a structural role or literary trope: mentor is removed from the fragment enumeration on this ground, and orphan, which earlier documents listed but no shipped v0.8 fragment enumerated, is likewise outside the canonical set. motivational_orientation gains authenticity (self-alignment and identity congruence), aligning the fragment with the canonical vocabulary. The shared meta.profile fragment is reconciled to the two-tier model (canonical enumeration plus the partner: pattern), and a mis-encoded enumeration on meta.tags is removed. A non-validating x-edm-canonical annotation is added to seven two-tier free-text fields, carrying the preferred canonical vocabulary in machine-readable form. The specification is published to npm (edm-spec@0.8.2). No fields are added, removed, or renamed. v0.8.2 shipped without a standalone document; its changes are documented in the v0.8.1-to-v0.8.2 crosswalk and folded into this v0.8.3 document.</w:t>
       </w:r>
     </w:p>
     <w:p>
@@ -11228,7 +10871,7 @@
         <w:jc w:val="both"/>
       </w:pPr>
       <w:r>
-        <w:t xml:space="preserve">v0.8.3 is a truth-only patch release. The Full Profile composite schema gains meta.source_timestamp in its inline meta block, conforming to the canonical meta fragment: the field, added in v0.7.0, had been strict-rejected by the composite's additionalProperties constraint since v0.8.0. The change is strictly widening — every artifact valid under v0.8.2 remains valid, and Full Profile artifacts carrying meta.source_timestamp now validate as the fragment always intended. The Full Profile field count is corrected to 91, the machine count of top-level fields across the ten domains of the shipped composite; the prior figure of 96 was hand arithmetic that never matched a shipped v0.8 schema. The narrative_archetype description is corrected to the identity-archetype definition throughout this document; the enumeration is unchanged at twelve. A one-story release policy is adopted (docs/RELEASE-POLICY.md): every npm release must have its document staged, npm and Zenodo publication occur together, and no certification claim may cite a version whose document is not published. No fields are introduced, deprecated, or semantically modified beyond the composite conformance correction.</w:t>
+        <w:t>v0.8.3 is a truth-only patch release. The Full Profile composite schema gains meta.source_timestamp in its inline meta block, conforming to the canonical meta fragment: the field, added in v0.7.0, had been strict-rejected by the composite's additionalProperties constraint since v0.8.0. The change is strictly widening — every artifact valid under v0.8.2 remains valid, and Full Profile artifacts carrying meta.source_timestamp now validate as the fragment always intended. The Full Profile field count is corrected to 91, the machine count of top-level fields across the ten domains of the shipped composite; the prior figure of 96 was hand arithmetic that never matched a shipped v0.8 schema. The narrative_archetype description is corrected to the identity-archetype definition throughout this document; the enumeration is unchanged at twelve. A one-story release policy is adopted (docs/RELEASE-POLICY.md): every npm release must have its document staged, npm and Zenodo publication occur together, and no certification claim may cite a version whose document is not published. No fields are introduced, deprecated, or semantically modified beyond the composite conformance correction.</w:t>
       </w:r>
     </w:p>
     <w:p>
@@ -11236,6 +10879,7 @@
         <w:pStyle w:val="Heading2"/>
       </w:pPr>
       <w:r>
+        <w:lastRenderedPageBreak/>
         <w:t>11.2 Migration Principles</w:t>
       </w:r>
     </w:p>
@@ -11379,61 +11023,58 @@
         <w:t>MUST</w:t>
       </w:r>
       <w:r>
-        <w:t xml:space="preserve"> be updated in both the </w:t>
-      </w:r>
+        <w:t xml:space="preserve"> be updated in both the artifact and </w:t>
+      </w:r>
+      <w:proofErr w:type="gramStart"/>
+      <w:r>
+        <w:t>the .</w:t>
+      </w:r>
+      <w:proofErr w:type="spellStart"/>
+      <w:r>
+        <w:t>ddna</w:t>
+      </w:r>
+      <w:proofErr w:type="spellEnd"/>
+      <w:proofErr w:type="gramEnd"/>
+      <w:r>
+        <w:t xml:space="preserve"> header, but no semantic transformation is permitted. </w:t>
+      </w:r>
+      <w:r>
+        <w:rPr>
+          <w:b/>
+          <w:bCs/>
+        </w:rPr>
+        <w:t>Downgrading</w:t>
+      </w:r>
+      <w:r>
+        <w:t xml:space="preserve"> requires removing fields that do not exist in the target version while strictly preserving the semantics and byte-level content of fields that remain valid. Systems </w:t>
+      </w:r>
+      <w:r>
+        <w:rPr>
+          <w:b/>
+          <w:bCs/>
+        </w:rPr>
+        <w:t>MUST NOT</w:t>
+      </w:r>
+      <w:r>
+        <w:t xml:space="preserve"> collapse, merge, compress, or reinterpret newer structures during a downgrade. Governance invariants </w:t>
+      </w:r>
+      <w:r>
+        <w:rPr>
+          <w:b/>
+          <w:bCs/>
+        </w:rPr>
+        <w:t>MUST</w:t>
+      </w:r>
+      <w:r>
+        <w:t xml:space="preserve"> remain stable across both lifting and downgrading operations. These processes maintain representational invariants and ensure that artifacts remain authoritative and interpretable within their target schema version.</w:t>
+      </w:r>
+    </w:p>
+    <w:p>
+      <w:pPr>
+        <w:pStyle w:val="Heading2"/>
+      </w:pPr>
       <w:r>
         <w:lastRenderedPageBreak/>
-        <w:t xml:space="preserve">artifact and </w:t>
-      </w:r>
-      <w:proofErr w:type="gramStart"/>
-      <w:r>
-        <w:t>the .</w:t>
-      </w:r>
-      <w:proofErr w:type="spellStart"/>
-      <w:r>
-        <w:t>ddna</w:t>
-      </w:r>
-      <w:proofErr w:type="spellEnd"/>
-      <w:proofErr w:type="gramEnd"/>
-      <w:r>
-        <w:t xml:space="preserve"> header, but no semantic transformation is permitted. </w:t>
-      </w:r>
-      <w:r>
-        <w:rPr>
-          <w:b/>
-          <w:bCs/>
-        </w:rPr>
-        <w:t>Downgrading</w:t>
-      </w:r>
-      <w:r>
-        <w:t xml:space="preserve"> requires removing fields that do not exist in the target version while strictly preserving the semantics and byte-level content of fields that remain valid. Systems </w:t>
-      </w:r>
-      <w:r>
-        <w:rPr>
-          <w:b/>
-          <w:bCs/>
-        </w:rPr>
-        <w:t>MUST NOT</w:t>
-      </w:r>
-      <w:r>
-        <w:t xml:space="preserve"> collapse, merge, compress, or reinterpret newer structures during a downgrade. Governance invariants </w:t>
-      </w:r>
-      <w:r>
-        <w:rPr>
-          <w:b/>
-          <w:bCs/>
-        </w:rPr>
-        <w:t>MUST</w:t>
-      </w:r>
-      <w:r>
-        <w:t xml:space="preserve"> remain stable across both lifting and downgrading operations. These processes maintain representational invariants and ensure that artifacts remain authoritative and interpretable within their target schema version.</w:t>
-      </w:r>
-    </w:p>
-    <w:p>
-      <w:pPr>
-        <w:pStyle w:val="Heading2"/>
-      </w:pPr>
-      <w:r>
         <w:t>11.5 Deprecated Structures</w:t>
       </w:r>
     </w:p>
@@ -11648,11 +11289,7 @@
         <w:t>crosswalks.HMD_v2_memory_type</w:t>
       </w:r>
       <w:r>
-        <w:t xml:space="preserve"> (string | null) — Deprecated. Provided a crosswalk mapping to HMD v2 memory type taxonomy. Removed following discontinuation of the HMD v2 taxonomy as a maintained external </w:t>
-      </w:r>
-      <w:r>
-        <w:lastRenderedPageBreak/>
-        <w:t>reference. Existing crosswalk mappings to this taxonomy retain frozen semantics in prior-version artifacts. Frozen;</w:t>
+        <w:t xml:space="preserve"> (string | null) — Deprecated. Provided a crosswalk mapping to HMD v2 memory type taxonomy. Removed following discontinuation of the HMD v2 taxonomy as a maintained external reference. Existing crosswalk mappings to this taxonomy retain frozen semantics in prior-version artifacts. Frozen;</w:t>
       </w:r>
       <w:r>
         <w:rPr>
@@ -11709,7 +11346,11 @@
         <w:t>Extensions</w:t>
       </w:r>
       <w:r>
-        <w:t xml:space="preserve"> must be predictable and non-breaking; new structures </w:t>
+        <w:t xml:space="preserve"> must be </w:t>
+      </w:r>
+      <w:r>
+        <w:lastRenderedPageBreak/>
+        <w:t xml:space="preserve">predictable and non-breaking; new structures </w:t>
       </w:r>
       <w:r>
         <w:rPr>
@@ -11887,7 +11528,6 @@
           <w:i/>
           <w:iCs/>
         </w:rPr>
-        <w:lastRenderedPageBreak/>
         <w:t xml:space="preserve">Explicit emotional state precedes representation; representation precedes computation. </w:t>
       </w:r>
       <w:r>
@@ -11954,6 +11594,7 @@
         <w:jc w:val="both"/>
       </w:pPr>
       <w:r>
+        <w:lastRenderedPageBreak/>
         <w:t>Technical evaluation access</w:t>
       </w:r>
     </w:p>
@@ -12264,76 +11905,76 @@
         <w:jc w:val="both"/>
       </w:pPr>
       <w:r>
+        <w:t>HL7 FHIR: Fast Healthcare Interoperability Resources (Foundation for Schema-First Governance).</w:t>
+      </w:r>
+    </w:p>
+    <w:p>
+      <w:pPr>
+        <w:pStyle w:val="Heading2"/>
+      </w:pPr>
+      <w:r>
+        <w:t>14.2 Cryptographic Standards</w:t>
+      </w:r>
+    </w:p>
+    <w:p>
+      <w:pPr>
+        <w:jc w:val="both"/>
+      </w:pPr>
+      <w:r>
+        <w:t>IETF RFC 8032: Edwards-Curve Digital Signature Algorithm (</w:t>
+      </w:r>
+      <w:proofErr w:type="spellStart"/>
+      <w:r>
+        <w:t>EdDSA</w:t>
+      </w:r>
+      <w:proofErr w:type="spellEnd"/>
+      <w:r>
+        <w:t>).</w:t>
+      </w:r>
+    </w:p>
+    <w:p>
+      <w:pPr>
+        <w:jc w:val="both"/>
+      </w:pPr>
+      <w:r>
+        <w:t xml:space="preserve">W3C CCG: </w:t>
+      </w:r>
+      <w:proofErr w:type="spellStart"/>
+      <w:r>
+        <w:t>did:key</w:t>
+      </w:r>
+      <w:proofErr w:type="spellEnd"/>
+      <w:r>
+        <w:t xml:space="preserve"> Method v1.0.</w:t>
+      </w:r>
+    </w:p>
+    <w:p>
+      <w:pPr>
+        <w:jc w:val="both"/>
+      </w:pPr>
+      <w:proofErr w:type="spellStart"/>
+      <w:r>
+        <w:t>Multiformats</w:t>
+      </w:r>
+      <w:proofErr w:type="spellEnd"/>
+      <w:r>
+        <w:t xml:space="preserve">: </w:t>
+      </w:r>
+      <w:proofErr w:type="spellStart"/>
+      <w:r>
+        <w:t>Multibase</w:t>
+      </w:r>
+      <w:proofErr w:type="spellEnd"/>
+      <w:r>
+        <w:t xml:space="preserve"> specification.</w:t>
+      </w:r>
+    </w:p>
+    <w:p>
+      <w:pPr>
+        <w:pStyle w:val="Heading2"/>
+      </w:pPr>
+      <w:r>
         <w:lastRenderedPageBreak/>
-        <w:t>HL7 FHIR: Fast Healthcare Interoperability Resources (Foundation for Schema-First Governance).</w:t>
-      </w:r>
-    </w:p>
-    <w:p>
-      <w:pPr>
-        <w:pStyle w:val="Heading2"/>
-      </w:pPr>
-      <w:r>
-        <w:t>14.2 Cryptographic Standards</w:t>
-      </w:r>
-    </w:p>
-    <w:p>
-      <w:pPr>
-        <w:jc w:val="both"/>
-      </w:pPr>
-      <w:r>
-        <w:t>IETF RFC 8032: Edwards-Curve Digital Signature Algorithm (</w:t>
-      </w:r>
-      <w:proofErr w:type="spellStart"/>
-      <w:r>
-        <w:t>EdDSA</w:t>
-      </w:r>
-      <w:proofErr w:type="spellEnd"/>
-      <w:r>
-        <w:t>).</w:t>
-      </w:r>
-    </w:p>
-    <w:p>
-      <w:pPr>
-        <w:jc w:val="both"/>
-      </w:pPr>
-      <w:r>
-        <w:t xml:space="preserve">W3C CCG: </w:t>
-      </w:r>
-      <w:proofErr w:type="spellStart"/>
-      <w:r>
-        <w:t>did:key</w:t>
-      </w:r>
-      <w:proofErr w:type="spellEnd"/>
-      <w:r>
-        <w:t xml:space="preserve"> Method v1.0.</w:t>
-      </w:r>
-    </w:p>
-    <w:p>
-      <w:pPr>
-        <w:jc w:val="both"/>
-      </w:pPr>
-      <w:proofErr w:type="spellStart"/>
-      <w:r>
-        <w:t>Multiformats</w:t>
-      </w:r>
-      <w:proofErr w:type="spellEnd"/>
-      <w:r>
-        <w:t xml:space="preserve">: </w:t>
-      </w:r>
-      <w:proofErr w:type="spellStart"/>
-      <w:r>
-        <w:t>Multibase</w:t>
-      </w:r>
-      <w:proofErr w:type="spellEnd"/>
-      <w:r>
-        <w:t xml:space="preserve"> specification.</w:t>
-      </w:r>
-    </w:p>
-    <w:p>
-      <w:pPr>
-        <w:pStyle w:val="Heading2"/>
-      </w:pPr>
-      <w:r>
         <w:t>14.3 Affective Neuroscience &amp; Cognition</w:t>
       </w:r>
     </w:p>
@@ -12569,7 +12210,6 @@
         <w:jc w:val="both"/>
       </w:pPr>
       <w:r>
-        <w:lastRenderedPageBreak/>
         <w:t xml:space="preserve">OpenAI. (2023). </w:t>
       </w:r>
       <w:r>
@@ -14940,6 +14580,7 @@
           <w:b/>
           <w:bCs/>
         </w:rPr>
+        <w:lastRenderedPageBreak/>
         <w:t>Constraints:</w:t>
       </w:r>
       <w:r>
@@ -14957,7 +14598,6 @@
         <w:rPr>
           <w:rStyle w:val="codestyle"/>
         </w:rPr>
-        <w:lastRenderedPageBreak/>
         <w:t>temporal_rhythm</w:t>
       </w:r>
       <w:proofErr w:type="spellEnd"/>
@@ -15288,11 +14928,11 @@
       </w:r>
       <w:proofErr w:type="gramEnd"/>
       <w:r>
-        <w:t xml:space="preserve"> accepted where no canonical value accurately represents the extracted content. NULL where no arc pattern is </w:t>
+        <w:t xml:space="preserve"> accepted where no canonical value </w:t>
       </w:r>
       <w:r>
         <w:lastRenderedPageBreak/>
-        <w:t>discernible. Extended Profile and Full Profile only. gratitude and authenticity added in v0.8.0.</w:t>
+        <w:t>accurately represents the extracted content. NULL where no arc pattern is discernible. Extended Profile and Full Profile only. gratitude and authenticity added in v0.8.0.</w:t>
       </w:r>
     </w:p>
     <w:p>
@@ -31117,36 +30757,28 @@
       </w:del>
       <w:ins w:id="2" w:author="Claude" w:date="2026-03-24T00:00:00Z">
         <w:r>
-          <w:t xml:space="preserve">    "payload_type": "edm.v0.8.3",</w:t>
+          <w:t xml:space="preserve">    "</w:t>
         </w:r>
         <w:proofErr w:type="spellStart"/>
         <w:proofErr w:type="gramStart"/>
         <w:r>
-          <w:t/>
+          <w:t>payload</w:t>
         </w:r>
         <w:proofErr w:type="gramEnd"/>
         <w:r>
-          <w:t/>
+          <w:t>_type</w:t>
         </w:r>
         <w:proofErr w:type="spellEnd"/>
         <w:r>
-          <w:t/>
+          <w:t>": "</w:t>
         </w:r>
         <w:proofErr w:type="gramStart"/>
         <w:r>
-          <w:t/>
+          <w:t>edm.v</w:t>
         </w:r>
-      </w:ins>
-      <w:r>
-        <w:t/>
-      </w:r>
-      <w:proofErr w:type="gramEnd"/>
-      <w:r>
-        <w:t/>
-      </w:r>
-      <w:ins w:id="3" w:author="Claude" w:date="2026-03-24T00:00:00Z">
+        <w:proofErr w:type="gramEnd"/>
         <w:r>
-          <w:t/>
+          <w:t>0.8.3",</w:t>
         </w:r>
       </w:ins>
     </w:p>
@@ -33220,15 +32852,15 @@
               </w:rPr>
             </w:pPr>
             <w:r>
-              <w:t xml:space="preserve">Type identifier for the payload (e.g., "edm.v0.8.3").</w:t>
+              <w:t>Type identifier for the payload (e.g., "</w:t>
             </w:r>
             <w:proofErr w:type="gramStart"/>
             <w:r>
-              <w:t/>
+              <w:t>edm.v</w:t>
             </w:r>
             <w:proofErr w:type="gramEnd"/>
             <w:r>
-              <w:t/>
+              <w:t>0.8.3").</w:t>
             </w:r>
           </w:p>
         </w:tc>

</xml_diff>